<commit_message>
docs: finalize release guidance and manual
</commit_message>
<xml_diff>
--- a/manual/Lemon串口监控-完整操作手册.docx
+++ b/manual/Lemon串口监控-完整操作手册.docx
@@ -63,7 +63,7 @@
           <w:color w:val="667085"/>
           <w:sz w:val="19"/>
         </w:rPr>
-        <w:t>适用：Windows 10/11 x64，Windows Server 2019/2022/2025 x64</w:t>
+        <w:t>兼容目标：Windows 10/11 x64，Windows Server 2019/2022/2025 x64</w:t>
       </w:r>
     </w:p>
     <w:p>
@@ -76,7 +76,7 @@
           <w:color w:val="667085"/>
           <w:sz w:val="19"/>
         </w:rPr>
-        <w:t>文档版本：0.1.0  |  2026-07-14</w:t>
+        <w:t>文档版本：0.1.0  |  2026-07-15</w:t>
       </w:r>
     </w:p>
     <w:p>
@@ -790,7 +790,7 @@
                 <w:color w:val="243447"/>
                 <w:sz w:val="18"/>
               </w:rPr>
-              <w:t>系统</w:t>
+              <w:t>兼容目标</w:t>
             </w:r>
           </w:p>
         </w:tc>
@@ -1129,6 +1129,17 @@
         </w:numPr>
       </w:pPr>
       <w:r>
+        <w:t>把自签名测试证书加入系统证书库会改变本机信任边界；持有对应私钥的人签名的代码可能在本机被信任。安装包只携带公钥，不包含私钥。</w:t>
+      </w:r>
+    </w:p>
+    <w:p>
+      <w:pPr>
+        <w:numPr>
+          <w:ilvl w:val="0"/>
+          <w:numId w:val="41"/>
+        </w:numPr>
+      </w:pPr>
+      <w:r>
         <w:t>需要时自动启用 TESTSIGNING，并明确提示重启。</w:t>
       </w:r>
     </w:p>
@@ -1152,6 +1163,44 @@
       </w:pPr>
       <w:r>
         <w:t>卸载只移除本次安装拥有的证书；只有安装程序实际改变 TESTSIGNING 时才恢复关闭。</w:t>
+      </w:r>
+    </w:p>
+    <w:p>
+      <w:pPr>
+        <w:numPr>
+          <w:ilvl w:val="0"/>
+          <w:numId w:val="41"/>
+        </w:numPr>
+      </w:pPr>
+      <w:r>
+        <w:t>安装文件没有微软信任链，也没有 RFC 3161 公共时间戳；首次运行仍可能显示 SmartScreen 或未知发布者。</w:t>
+      </w:r>
+    </w:p>
+    <w:p>
+      <w:pPr>
+        <w:spacing w:before="80" w:after="160" w:line="288" w:lineRule="auto"/>
+        <w:shd w:fill="FDECEC"/>
+        <w:pBdr>
+          <w:left w:val="single" w:sz="18" w:space="7" w:color="C62828"/>
+        </w:pBdr>
+        <w:ind w:left="160" w:right="100"/>
+      </w:pPr>
+      <w:r>
+        <w:rPr>
+          <w:rFonts w:ascii="Calibri" w:hAnsi="Calibri" w:eastAsia="Microsoft YaHei UI"/>
+          <w:b/>
+          <w:color w:val="C62828"/>
+          <w:sz w:val="21"/>
+        </w:rPr>
+        <w:t>先核对来源：</w:t>
+      </w:r>
+      <w:r>
+        <w:rPr>
+          <w:rFonts w:ascii="Calibri" w:hAnsi="Calibri" w:eastAsia="Microsoft YaHei UI"/>
+          <w:color w:val="243447"/>
+          <w:sz w:val="21"/>
+        </w:rPr>
+        <w:t>测试证书要等安装程序取得管理员权限后才能导入。只从本项目 GitHub Release 下载，并在运行前核对 SHA256SUMS.txt。</w:t>
       </w:r>
     </w:p>
     <w:p>
@@ -1181,7 +1230,7 @@
         </w:numPr>
       </w:pPr>
       <w:r>
-        <w:t>在 UAC 提示中核对程序名称并点击“是”。</w:t>
+        <w:t>遇到 SmartScreen 或 UAC 时核对下载来源和 SHA-256，再按 Windows 提示继续。</w:t>
       </w:r>
     </w:p>
     <w:p>
@@ -1236,7 +1285,7 @@
         </w:numPr>
       </w:pPr>
       <w:r>
-        <w:t>提示重启时保存工作并立即重启，重启后再判断驱动是否可用。</w:t>
+        <w:t>提示重启时先保存工作，再按提示重启；重启后再判断驱动是否可用。</w:t>
       </w:r>
     </w:p>
     <w:p>
@@ -1700,6 +1749,33 @@
       </w:pPr>
       <w:r>
         <w:t>点击“停止”，完成一次 CSV 导出。</w:t>
+      </w:r>
+    </w:p>
+    <w:p>
+      <w:pPr>
+        <w:spacing w:before="80" w:after="160" w:line="288" w:lineRule="auto"/>
+        <w:shd w:fill="F4F6F9"/>
+        <w:pBdr>
+          <w:left w:val="single" w:sz="18" w:space="7" w:color="2E74B5"/>
+        </w:pBdr>
+        <w:ind w:left="160" w:right="100"/>
+      </w:pPr>
+      <w:r>
+        <w:rPr>
+          <w:rFonts w:ascii="Calibri" w:hAnsi="Calibri" w:eastAsia="Microsoft YaHei UI"/>
+          <w:b/>
+          <w:color w:val="2E74B5"/>
+          <w:sz w:val="21"/>
+        </w:rPr>
+        <w:t>当前没有串口设备：</w:t>
+      </w:r>
+      <w:r>
+        <w:rPr>
+          <w:rFonts w:ascii="Calibri" w:hAnsi="Calibri" w:eastAsia="Microsoft YaHei UI"/>
+          <w:color w:val="243447"/>
+          <w:sz w:val="21"/>
+        </w:rPr>
+        <w:t>后台服务仍应保持运行。刷新后显示服务已连接、端口列表为空、驱动暂不可用属于正常状态；接入真实设备后再次刷新，不需要反复重装。</w:t>
       </w:r>
     </w:p>
     <w:p>
@@ -4535,6 +4611,11 @@
       </w:r>
     </w:p>
     <w:p>
+      <w:r>
+        <w:t>没有接入串口设备时，状态工具仍应返回服务可用，driverState 可为不可用，端口工具返回空数组。这是正常的无设备状态，AI 不应把它解释成后台服务崩溃。</w:t>
+      </w:r>
+    </w:p>
+    <w:p>
       <w:pPr>
         <w:pStyle w:val="Heading2"/>
       </w:pPr>
@@ -4726,7 +4807,51 @@
           <w:color w:val="243447"/>
           <w:sz w:val="17"/>
         </w:rPr>
+        <w:t>&amp; $lemon capture pause --lease-id '&lt;leaseId&gt;' --json</w:t>
+      </w:r>
+      <w:r>
+        <w:br/>
+      </w:r>
+      <w:r>
+        <w:rPr>
+          <w:rFonts w:ascii="Consolas" w:hAnsi="Consolas" w:eastAsia="Microsoft YaHei UI"/>
+          <w:color w:val="243447"/>
+          <w:sz w:val="17"/>
+        </w:rPr>
+        <w:t>&amp; $lemon capture resume --lease-id '&lt;leaseId&gt;' --json</w:t>
+      </w:r>
+      <w:r>
+        <w:br/>
+      </w:r>
+      <w:r>
+        <w:rPr>
+          <w:rFonts w:ascii="Consolas" w:hAnsi="Consolas" w:eastAsia="Microsoft YaHei UI"/>
+          <w:color w:val="243447"/>
+          <w:sz w:val="17"/>
+        </w:rPr>
         <w:t>&amp; $lemon events read --session-id '&lt;sessionId&gt;' --limit 100 --include-hex --json</w:t>
+      </w:r>
+      <w:r>
+        <w:br/>
+      </w:r>
+      <w:r>
+        <w:rPr>
+          <w:rFonts w:ascii="Consolas" w:hAnsi="Consolas" w:eastAsia="Microsoft YaHei UI"/>
+          <w:color w:val="243447"/>
+          <w:sz w:val="17"/>
+        </w:rPr>
+        <w:t>&amp; $lemon events wait --session-id '&lt;sessionId&gt;' --cursor '&lt;nextCursor&gt;' --resume-receipt '&lt;resumeReceipt&gt;' --limit 100 --timeout-seconds 30 --include-hex --jsonl</w:t>
+      </w:r>
+      <w:r>
+        <w:br/>
+      </w:r>
+      <w:r>
+        <w:rPr>
+          <w:rFonts w:ascii="Consolas" w:hAnsi="Consolas" w:eastAsia="Microsoft YaHei UI"/>
+          <w:color w:val="243447"/>
+          <w:sz w:val="17"/>
+        </w:rPr>
+        <w:t>&amp; $lemon export --session-id '&lt;sessionId&gt;' --format jsonl --label board-test --json</w:t>
       </w:r>
       <w:r>
         <w:br/>
@@ -4745,7 +4870,529 @@
         <w:pStyle w:val="Heading2"/>
       </w:pPr>
       <w:r>
-        <w:t>10.4 完整性判定</w:t>
+        <w:t>10.4 CLI 退出码</w:t>
+      </w:r>
+    </w:p>
+    <w:tbl>
+      <w:tblPr>
+        <w:tblStyle w:val="TableGrid"/>
+        <w:jc w:val="left"/>
+        <w:tblLook w:firstColumn="1" w:firstRow="1" w:lastColumn="0" w:lastRow="0" w:noHBand="0" w:noVBand="1" w:val="04A0"/>
+        <w:tblW w:w="9360" w:type="dxa"/>
+        <w:tblInd w:w="120" w:type="dxa"/>
+        <w:tblLayout w:type="fixed"/>
+      </w:tblPr>
+      <w:tblGrid>
+        <w:gridCol w:w="1700"/>
+        <w:gridCol w:w="7660"/>
+      </w:tblGrid>
+      <w:tr>
+        <w:trPr>
+          <w:tblHeader w:val="true"/>
+        </w:trPr>
+        <w:tc>
+          <w:tcPr>
+            <w:tcW w:type="dxa" w:w="1700"/>
+            <w:shd w:fill="E8EEF5"/>
+            <w:vAlign w:val="center"/>
+            <w:tcMar>
+              <w:top w:w="80" w:type="dxa"/>
+              <w:start w:w="120" w:type="dxa"/>
+              <w:bottom w:w="80" w:type="dxa"/>
+              <w:end w:w="120" w:type="dxa"/>
+            </w:tcMar>
+          </w:tcPr>
+          <w:p>
+            <w:pPr>
+              <w:spacing w:after="0"/>
+              <w:jc w:val="center"/>
+            </w:pPr>
+            <w:r/>
+            <w:r>
+              <w:rPr>
+                <w:rFonts w:ascii="Calibri" w:hAnsi="Calibri" w:eastAsia="Microsoft YaHei UI"/>
+                <w:b/>
+                <w:color w:val="203748"/>
+                <w:sz w:val="19"/>
+              </w:rPr>
+              <w:t>退出码</w:t>
+            </w:r>
+          </w:p>
+        </w:tc>
+        <w:tc>
+          <w:tcPr>
+            <w:tcW w:type="dxa" w:w="7660"/>
+            <w:shd w:fill="E8EEF5"/>
+            <w:vAlign w:val="center"/>
+            <w:tcMar>
+              <w:top w:w="80" w:type="dxa"/>
+              <w:start w:w="120" w:type="dxa"/>
+              <w:bottom w:w="80" w:type="dxa"/>
+              <w:end w:w="120" w:type="dxa"/>
+            </w:tcMar>
+          </w:tcPr>
+          <w:p>
+            <w:pPr>
+              <w:spacing w:after="0"/>
+              <w:jc w:val="center"/>
+            </w:pPr>
+            <w:r/>
+            <w:r>
+              <w:rPr>
+                <w:rFonts w:ascii="Calibri" w:hAnsi="Calibri" w:eastAsia="Microsoft YaHei UI"/>
+                <w:b/>
+                <w:color w:val="203748"/>
+                <w:sz w:val="19"/>
+              </w:rPr>
+              <w:t>含义</w:t>
+            </w:r>
+          </w:p>
+        </w:tc>
+      </w:tr>
+      <w:tr>
+        <w:tc>
+          <w:tcPr>
+            <w:tcW w:type="dxa" w:w="1700"/>
+            <w:vAlign w:val="center"/>
+            <w:tcMar>
+              <w:top w:w="80" w:type="dxa"/>
+              <w:start w:w="120" w:type="dxa"/>
+              <w:bottom w:w="80" w:type="dxa"/>
+              <w:end w:w="120" w:type="dxa"/>
+            </w:tcMar>
+          </w:tcPr>
+          <w:p>
+            <w:pPr>
+              <w:spacing w:after="0" w:line="276" w:lineRule="auto"/>
+            </w:pPr>
+            <w:r/>
+            <w:r>
+              <w:rPr>
+                <w:rFonts w:ascii="Calibri" w:hAnsi="Calibri" w:eastAsia="Microsoft YaHei UI"/>
+                <w:color w:val="243447"/>
+                <w:sz w:val="18"/>
+              </w:rPr>
+              <w:t>0</w:t>
+            </w:r>
+          </w:p>
+        </w:tc>
+        <w:tc>
+          <w:tcPr>
+            <w:tcW w:type="dxa" w:w="7660"/>
+            <w:vAlign w:val="center"/>
+            <w:tcMar>
+              <w:top w:w="80" w:type="dxa"/>
+              <w:start w:w="120" w:type="dxa"/>
+              <w:bottom w:w="80" w:type="dxa"/>
+              <w:end w:w="120" w:type="dxa"/>
+            </w:tcMar>
+          </w:tcPr>
+          <w:p>
+            <w:pPr>
+              <w:spacing w:after="0" w:line="276" w:lineRule="auto"/>
+            </w:pPr>
+            <w:r/>
+            <w:r>
+              <w:rPr>
+                <w:rFonts w:ascii="Calibri" w:hAnsi="Calibri" w:eastAsia="Microsoft YaHei UI"/>
+                <w:color w:val="243447"/>
+                <w:sz w:val="18"/>
+              </w:rPr>
+              <w:t>成功</w:t>
+            </w:r>
+          </w:p>
+        </w:tc>
+      </w:tr>
+      <w:tr>
+        <w:tc>
+          <w:tcPr>
+            <w:tcW w:type="dxa" w:w="1700"/>
+            <w:vAlign w:val="center"/>
+            <w:tcMar>
+              <w:top w:w="80" w:type="dxa"/>
+              <w:start w:w="120" w:type="dxa"/>
+              <w:bottom w:w="80" w:type="dxa"/>
+              <w:end w:w="120" w:type="dxa"/>
+            </w:tcMar>
+          </w:tcPr>
+          <w:p>
+            <w:pPr>
+              <w:spacing w:after="0" w:line="276" w:lineRule="auto"/>
+            </w:pPr>
+            <w:r/>
+            <w:r>
+              <w:rPr>
+                <w:rFonts w:ascii="Calibri" w:hAnsi="Calibri" w:eastAsia="Microsoft YaHei UI"/>
+                <w:color w:val="243447"/>
+                <w:sz w:val="18"/>
+              </w:rPr>
+              <w:t>2</w:t>
+            </w:r>
+          </w:p>
+        </w:tc>
+        <w:tc>
+          <w:tcPr>
+            <w:tcW w:type="dxa" w:w="7660"/>
+            <w:vAlign w:val="center"/>
+            <w:tcMar>
+              <w:top w:w="80" w:type="dxa"/>
+              <w:start w:w="120" w:type="dxa"/>
+              <w:bottom w:w="80" w:type="dxa"/>
+              <w:end w:w="120" w:type="dxa"/>
+            </w:tcMar>
+          </w:tcPr>
+          <w:p>
+            <w:pPr>
+              <w:spacing w:after="0" w:line="276" w:lineRule="auto"/>
+            </w:pPr>
+            <w:r/>
+            <w:r>
+              <w:rPr>
+                <w:rFonts w:ascii="Calibri" w:hAnsi="Calibri" w:eastAsia="Microsoft YaHei UI"/>
+                <w:color w:val="243447"/>
+                <w:sz w:val="18"/>
+              </w:rPr>
+              <w:t>参数或输入错误</w:t>
+            </w:r>
+          </w:p>
+        </w:tc>
+      </w:tr>
+      <w:tr>
+        <w:tc>
+          <w:tcPr>
+            <w:tcW w:type="dxa" w:w="1700"/>
+            <w:vAlign w:val="center"/>
+            <w:tcMar>
+              <w:top w:w="80" w:type="dxa"/>
+              <w:start w:w="120" w:type="dxa"/>
+              <w:bottom w:w="80" w:type="dxa"/>
+              <w:end w:w="120" w:type="dxa"/>
+            </w:tcMar>
+          </w:tcPr>
+          <w:p>
+            <w:pPr>
+              <w:spacing w:after="0" w:line="276" w:lineRule="auto"/>
+            </w:pPr>
+            <w:r/>
+            <w:r>
+              <w:rPr>
+                <w:rFonts w:ascii="Calibri" w:hAnsi="Calibri" w:eastAsia="Microsoft YaHei UI"/>
+                <w:color w:val="243447"/>
+                <w:sz w:val="18"/>
+              </w:rPr>
+              <w:t>3</w:t>
+            </w:r>
+          </w:p>
+        </w:tc>
+        <w:tc>
+          <w:tcPr>
+            <w:tcW w:type="dxa" w:w="7660"/>
+            <w:vAlign w:val="center"/>
+            <w:tcMar>
+              <w:top w:w="80" w:type="dxa"/>
+              <w:start w:w="120" w:type="dxa"/>
+              <w:bottom w:w="80" w:type="dxa"/>
+              <w:end w:w="120" w:type="dxa"/>
+            </w:tcMar>
+          </w:tcPr>
+          <w:p>
+            <w:pPr>
+              <w:spacing w:after="0" w:line="276" w:lineRule="auto"/>
+            </w:pPr>
+            <w:r/>
+            <w:r>
+              <w:rPr>
+                <w:rFonts w:ascii="Calibri" w:hAnsi="Calibri" w:eastAsia="Microsoft YaHei UI"/>
+                <w:color w:val="243447"/>
+                <w:sz w:val="18"/>
+              </w:rPr>
+              <w:t>访问被拒绝或协议不兼容</w:t>
+            </w:r>
+          </w:p>
+        </w:tc>
+      </w:tr>
+      <w:tr>
+        <w:tc>
+          <w:tcPr>
+            <w:tcW w:type="dxa" w:w="1700"/>
+            <w:vAlign w:val="center"/>
+            <w:tcMar>
+              <w:top w:w="80" w:type="dxa"/>
+              <w:start w:w="120" w:type="dxa"/>
+              <w:bottom w:w="80" w:type="dxa"/>
+              <w:end w:w="120" w:type="dxa"/>
+            </w:tcMar>
+          </w:tcPr>
+          <w:p>
+            <w:pPr>
+              <w:spacing w:after="0" w:line="276" w:lineRule="auto"/>
+            </w:pPr>
+            <w:r/>
+            <w:r>
+              <w:rPr>
+                <w:rFonts w:ascii="Calibri" w:hAnsi="Calibri" w:eastAsia="Microsoft YaHei UI"/>
+                <w:color w:val="243447"/>
+                <w:sz w:val="18"/>
+              </w:rPr>
+              <w:t>4</w:t>
+            </w:r>
+          </w:p>
+        </w:tc>
+        <w:tc>
+          <w:tcPr>
+            <w:tcW w:type="dxa" w:w="7660"/>
+            <w:vAlign w:val="center"/>
+            <w:tcMar>
+              <w:top w:w="80" w:type="dxa"/>
+              <w:start w:w="120" w:type="dxa"/>
+              <w:bottom w:w="80" w:type="dxa"/>
+              <w:end w:w="120" w:type="dxa"/>
+            </w:tcMar>
+          </w:tcPr>
+          <w:p>
+            <w:pPr>
+              <w:spacing w:after="0" w:line="276" w:lineRule="auto"/>
+            </w:pPr>
+            <w:r/>
+            <w:r>
+              <w:rPr>
+                <w:rFonts w:ascii="Calibri" w:hAnsi="Calibri" w:eastAsia="Microsoft YaHei UI"/>
+                <w:color w:val="243447"/>
+                <w:sz w:val="18"/>
+              </w:rPr>
+              <w:t>后台服务、驱动或设备不可用</w:t>
+            </w:r>
+          </w:p>
+        </w:tc>
+      </w:tr>
+      <w:tr>
+        <w:tc>
+          <w:tcPr>
+            <w:tcW w:type="dxa" w:w="1700"/>
+            <w:vAlign w:val="center"/>
+            <w:tcMar>
+              <w:top w:w="80" w:type="dxa"/>
+              <w:start w:w="120" w:type="dxa"/>
+              <w:bottom w:w="80" w:type="dxa"/>
+              <w:end w:w="120" w:type="dxa"/>
+            </w:tcMar>
+          </w:tcPr>
+          <w:p>
+            <w:pPr>
+              <w:spacing w:after="0" w:line="276" w:lineRule="auto"/>
+            </w:pPr>
+            <w:r/>
+            <w:r>
+              <w:rPr>
+                <w:rFonts w:ascii="Calibri" w:hAnsi="Calibri" w:eastAsia="Microsoft YaHei UI"/>
+                <w:color w:val="243447"/>
+                <w:sz w:val="18"/>
+              </w:rPr>
+              <w:t>5</w:t>
+            </w:r>
+          </w:p>
+        </w:tc>
+        <w:tc>
+          <w:tcPr>
+            <w:tcW w:type="dxa" w:w="7660"/>
+            <w:vAlign w:val="center"/>
+            <w:tcMar>
+              <w:top w:w="80" w:type="dxa"/>
+              <w:start w:w="120" w:type="dxa"/>
+              <w:bottom w:w="80" w:type="dxa"/>
+              <w:end w:w="120" w:type="dxa"/>
+            </w:tcMar>
+          </w:tcPr>
+          <w:p>
+            <w:pPr>
+              <w:spacing w:after="0" w:line="276" w:lineRule="auto"/>
+            </w:pPr>
+            <w:r/>
+            <w:r>
+              <w:rPr>
+                <w:rFonts w:ascii="Calibri" w:hAnsi="Calibri" w:eastAsia="Microsoft YaHei UI"/>
+                <w:color w:val="243447"/>
+                <w:sz w:val="18"/>
+              </w:rPr>
+              <w:t>捕获冲突，或租约无效/过期</w:t>
+            </w:r>
+          </w:p>
+        </w:tc>
+      </w:tr>
+      <w:tr>
+        <w:tc>
+          <w:tcPr>
+            <w:tcW w:type="dxa" w:w="1700"/>
+            <w:vAlign w:val="center"/>
+            <w:tcMar>
+              <w:top w:w="80" w:type="dxa"/>
+              <w:start w:w="120" w:type="dxa"/>
+              <w:bottom w:w="80" w:type="dxa"/>
+              <w:end w:w="120" w:type="dxa"/>
+            </w:tcMar>
+          </w:tcPr>
+          <w:p>
+            <w:pPr>
+              <w:spacing w:after="0" w:line="276" w:lineRule="auto"/>
+            </w:pPr>
+            <w:r/>
+            <w:r>
+              <w:rPr>
+                <w:rFonts w:ascii="Calibri" w:hAnsi="Calibri" w:eastAsia="Microsoft YaHei UI"/>
+                <w:color w:val="243447"/>
+                <w:sz w:val="18"/>
+              </w:rPr>
+              <w:t>6</w:t>
+            </w:r>
+          </w:p>
+        </w:tc>
+        <w:tc>
+          <w:tcPr>
+            <w:tcW w:type="dxa" w:w="7660"/>
+            <w:vAlign w:val="center"/>
+            <w:tcMar>
+              <w:top w:w="80" w:type="dxa"/>
+              <w:start w:w="120" w:type="dxa"/>
+              <w:bottom w:w="80" w:type="dxa"/>
+              <w:end w:w="120" w:type="dxa"/>
+            </w:tcMar>
+          </w:tcPr>
+          <w:p>
+            <w:pPr>
+              <w:spacing w:after="0" w:line="276" w:lineRule="auto"/>
+            </w:pPr>
+            <w:r/>
+            <w:r>
+              <w:rPr>
+                <w:rFonts w:ascii="Calibri" w:hAnsi="Calibri" w:eastAsia="Microsoft YaHei UI"/>
+                <w:color w:val="243447"/>
+                <w:sz w:val="18"/>
+              </w:rPr>
+              <w:t>数据缺口、完整性未知或连续性未证明</w:t>
+            </w:r>
+          </w:p>
+        </w:tc>
+      </w:tr>
+      <w:tr>
+        <w:tc>
+          <w:tcPr>
+            <w:tcW w:type="dxa" w:w="1700"/>
+            <w:vAlign w:val="center"/>
+            <w:tcMar>
+              <w:top w:w="80" w:type="dxa"/>
+              <w:start w:w="120" w:type="dxa"/>
+              <w:bottom w:w="80" w:type="dxa"/>
+              <w:end w:w="120" w:type="dxa"/>
+            </w:tcMar>
+          </w:tcPr>
+          <w:p>
+            <w:pPr>
+              <w:spacing w:after="0" w:line="276" w:lineRule="auto"/>
+            </w:pPr>
+            <w:r/>
+            <w:r>
+              <w:rPr>
+                <w:rFonts w:ascii="Calibri" w:hAnsi="Calibri" w:eastAsia="Microsoft YaHei UI"/>
+                <w:color w:val="243447"/>
+                <w:sz w:val="18"/>
+              </w:rPr>
+              <w:t>7</w:t>
+            </w:r>
+          </w:p>
+        </w:tc>
+        <w:tc>
+          <w:tcPr>
+            <w:tcW w:type="dxa" w:w="7660"/>
+            <w:vAlign w:val="center"/>
+            <w:tcMar>
+              <w:top w:w="80" w:type="dxa"/>
+              <w:start w:w="120" w:type="dxa"/>
+              <w:bottom w:w="80" w:type="dxa"/>
+              <w:end w:w="120" w:type="dxa"/>
+            </w:tcMar>
+          </w:tcPr>
+          <w:p>
+            <w:pPr>
+              <w:spacing w:after="0" w:line="276" w:lineRule="auto"/>
+            </w:pPr>
+            <w:r/>
+            <w:r>
+              <w:rPr>
+                <w:rFonts w:ascii="Calibri" w:hAnsi="Calibri" w:eastAsia="Microsoft YaHei UI"/>
+                <w:color w:val="243447"/>
+                <w:sz w:val="18"/>
+              </w:rPr>
+              <w:t>超时或操作取消</w:t>
+            </w:r>
+          </w:p>
+        </w:tc>
+      </w:tr>
+      <w:tr>
+        <w:tc>
+          <w:tcPr>
+            <w:tcW w:type="dxa" w:w="1700"/>
+            <w:vAlign w:val="center"/>
+            <w:tcMar>
+              <w:top w:w="80" w:type="dxa"/>
+              <w:start w:w="120" w:type="dxa"/>
+              <w:bottom w:w="80" w:type="dxa"/>
+              <w:end w:w="120" w:type="dxa"/>
+            </w:tcMar>
+          </w:tcPr>
+          <w:p>
+            <w:pPr>
+              <w:spacing w:after="0" w:line="276" w:lineRule="auto"/>
+            </w:pPr>
+            <w:r/>
+            <w:r>
+              <w:rPr>
+                <w:rFonts w:ascii="Calibri" w:hAnsi="Calibri" w:eastAsia="Microsoft YaHei UI"/>
+                <w:color w:val="243447"/>
+                <w:sz w:val="18"/>
+              </w:rPr>
+              <w:t>10</w:t>
+            </w:r>
+          </w:p>
+        </w:tc>
+        <w:tc>
+          <w:tcPr>
+            <w:tcW w:type="dxa" w:w="7660"/>
+            <w:vAlign w:val="center"/>
+            <w:tcMar>
+              <w:top w:w="80" w:type="dxa"/>
+              <w:start w:w="120" w:type="dxa"/>
+              <w:bottom w:w="80" w:type="dxa"/>
+              <w:end w:w="120" w:type="dxa"/>
+            </w:tcMar>
+          </w:tcPr>
+          <w:p>
+            <w:pPr>
+              <w:spacing w:after="0" w:line="276" w:lineRule="auto"/>
+            </w:pPr>
+            <w:r/>
+            <w:r>
+              <w:rPr>
+                <w:rFonts w:ascii="Calibri" w:hAnsi="Calibri" w:eastAsia="Microsoft YaHei UI"/>
+                <w:color w:val="243447"/>
+                <w:sz w:val="18"/>
+              </w:rPr>
+              <w:t>未预期运行错误</w:t>
+            </w:r>
+          </w:p>
+        </w:tc>
+      </w:tr>
+    </w:tbl>
+    <w:p>
+      <w:pPr>
+        <w:spacing w:after="40"/>
+      </w:pPr>
+    </w:p>
+    <w:p>
+      <w:pPr>
+        <w:pStyle w:val="Heading2"/>
+      </w:pPr>
+      <w:r>
+        <w:t>10.5 完整性判定</w:t>
       </w:r>
     </w:p>
     <w:tbl>
@@ -5386,6 +6033,33 @@
     </w:p>
     <w:p>
       <w:pPr>
+        <w:spacing w:before="80" w:after="160" w:line="288" w:lineRule="auto"/>
+        <w:shd w:fill="FFF4CE"/>
+        <w:pBdr>
+          <w:left w:val="single" w:sz="18" w:space="7" w:color="9A6700"/>
+        </w:pBdr>
+        <w:ind w:left="160" w:right="100"/>
+      </w:pPr>
+      <w:r>
+        <w:rPr>
+          <w:rFonts w:ascii="Calibri" w:hAnsi="Calibri" w:eastAsia="Microsoft YaHei UI"/>
+          <w:b/>
+          <w:color w:val="9A6700"/>
+          <w:sz w:val="21"/>
+        </w:rPr>
+        <w:t>验证范围：</w:t>
+      </w:r>
+      <w:r>
+        <w:rPr>
+          <w:rFonts w:ascii="Calibri" w:hAnsi="Calibri" w:eastAsia="Microsoft YaHei UI"/>
+          <w:color w:val="243447"/>
+          <w:sz w:val="21"/>
+        </w:rPr>
+        <w:t>Windows Server 2022/2025 只完成 GitHub 托管桌面 runner 的平台、托管测试和安装契约检查，未装载内核驱动；Server Core 只有布局契约测试，Server 2019 自托管任务未执行。0.1.0 没有任何 Server 驱动端到端实测，重要环境必须先在同版本测试机完成全流程验证。</w:t>
+      </w:r>
+    </w:p>
+    <w:p>
+      <w:pPr>
         <w:pStyle w:val="Heading1"/>
       </w:pPr>
       <w:r>
@@ -5498,7 +6172,7 @@
     </w:p>
     <w:p>
       <w:r>
-        <w:t>不要直接覆盖正在加载的 SYS、后台服务 EXE 或受保护安装记录。</w:t>
+        <w:t>0.1.0 不支持在已有新式安装上原地覆盖。不要直接覆盖正在加载的 SYS、后台服务 EXE 或受保护安装记录。</w:t>
       </w:r>
     </w:p>
     <w:p>
@@ -5691,6 +6365,86 @@
                 <w:sz w:val="18"/>
               </w:rPr>
               <w:t>核对 COM 号和状态栏错误</w:t>
+            </w:r>
+          </w:p>
+        </w:tc>
+      </w:tr>
+      <w:tr>
+        <w:tc>
+          <w:tcPr>
+            <w:tcW w:type="dxa" w:w="1800"/>
+            <w:vAlign w:val="center"/>
+            <w:tcMar>
+              <w:top w:w="80" w:type="dxa"/>
+              <w:start w:w="120" w:type="dxa"/>
+              <w:bottom w:w="80" w:type="dxa"/>
+              <w:end w:w="120" w:type="dxa"/>
+            </w:tcMar>
+          </w:tcPr>
+          <w:p>
+            <w:pPr>
+              <w:spacing w:after="0" w:line="276" w:lineRule="auto"/>
+            </w:pPr>
+            <w:r/>
+            <w:r>
+              <w:rPr>
+                <w:rFonts w:ascii="Calibri" w:hAnsi="Calibri" w:eastAsia="Microsoft YaHei UI"/>
+                <w:color w:val="243447"/>
+                <w:sz w:val="18"/>
+              </w:rPr>
+              <w:t>端口为空</w:t>
+            </w:r>
+          </w:p>
+        </w:tc>
+        <w:tc>
+          <w:tcPr>
+            <w:tcW w:type="dxa" w:w="3300"/>
+            <w:vAlign w:val="center"/>
+            <w:tcMar>
+              <w:top w:w="80" w:type="dxa"/>
+              <w:start w:w="120" w:type="dxa"/>
+              <w:bottom w:w="80" w:type="dxa"/>
+              <w:end w:w="120" w:type="dxa"/>
+            </w:tcMar>
+          </w:tcPr>
+          <w:p>
+            <w:pPr>
+              <w:spacing w:after="0" w:line="276" w:lineRule="auto"/>
+            </w:pPr>
+            <w:r/>
+            <w:r>
+              <w:rPr>
+                <w:rFonts w:ascii="Calibri" w:hAnsi="Calibri" w:eastAsia="Microsoft YaHei UI"/>
+                <w:color w:val="243447"/>
+                <w:sz w:val="18"/>
+              </w:rPr>
+              <w:t>确认设备管理器是否存在可用串口</w:t>
+            </w:r>
+          </w:p>
+        </w:tc>
+        <w:tc>
+          <w:tcPr>
+            <w:tcW w:type="dxa" w:w="4260"/>
+            <w:vAlign w:val="center"/>
+            <w:tcMar>
+              <w:top w:w="80" w:type="dxa"/>
+              <w:start w:w="120" w:type="dxa"/>
+              <w:bottom w:w="80" w:type="dxa"/>
+              <w:end w:w="120" w:type="dxa"/>
+            </w:tcMar>
+          </w:tcPr>
+          <w:p>
+            <w:pPr>
+              <w:spacing w:after="0" w:line="276" w:lineRule="auto"/>
+            </w:pPr>
+            <w:r/>
+            <w:r>
+              <w:rPr>
+                <w:rFonts w:ascii="Calibri" w:hAnsi="Calibri" w:eastAsia="Microsoft YaHei UI"/>
+                <w:color w:val="243447"/>
+                <w:sz w:val="18"/>
+              </w:rPr>
+              <w:t>无设备时服务运行、驱动暂不可用属于正常状态</w:t>
             </w:r>
           </w:p>
         </w:tc>
@@ -6343,7 +7097,7 @@
         </w:numPr>
       </w:pPr>
       <w:r>
-        <w:t>等待驱动、服务、过滤器、证书、文件和数据清理。</w:t>
+        <w:t>卸载程序会先关闭本软件桌面程序、AI 客户端和后台服务，再清理驱动、过滤器、证书、文件和数据。</w:t>
       </w:r>
     </w:p>
     <w:p>
@@ -6354,7 +7108,12 @@
         </w:numPr>
       </w:pPr>
       <w:r>
-        <w:t>提示重启时立即重启；卸载程序会自动继续并核验残留。</w:t>
+        <w:t>提示重启时先保存工作，再按提示重启；卸载程序会自动继续并核验残留。</w:t>
+      </w:r>
+    </w:p>
+    <w:p>
+      <w:r>
+        <w:t>正常用户态文件不应只因本软件自身仍在运行而要求重启；内核驱动、Ports 类设备栈、启动策略或 Windows 文件锁仍可能必须在重启后完成清理。</w:t>
       </w:r>
     </w:p>
     <w:p>
@@ -6853,6 +7612,11 @@
       </w:pPr>
     </w:p>
     <w:p>
+      <w:r>
+        <w:br w:type="page"/>
+      </w:r>
+    </w:p>
+    <w:p>
       <w:pPr>
         <w:pStyle w:val="Heading1"/>
       </w:pPr>
@@ -6882,6 +7646,14 @@
       </w:pPr>
       <w:r>
         <w:t>□ 监控前刷新、勾选并点击开始。</w:t>
+      </w:r>
+    </w:p>
+    <w:p>
+      <w:pPr>
+        <w:ind w:left="317" w:hanging="317"/>
+      </w:pPr>
+      <w:r>
+        <w:t>□ 无设备时已确认服务保持运行，接入设备后再刷新。</w:t>
       </w:r>
     </w:p>
     <w:p>

</xml_diff>

<commit_message>
docs: prepare bilingual 0.1.1 release
</commit_message>
<xml_diff>
--- a/manual/Lemon串口监控-完整操作手册.docx
+++ b/manual/Lemon串口监控-完整操作手册.docx
@@ -19,7 +19,7 @@
           <w:color w:val="2E74B5"/>
           <w:sz w:val="20"/>
         </w:rPr>
-        <w:t>WINDOWS 串口被动监控  |  0.1.0</w:t>
+        <w:t>WINDOWS 串口被动监控  |  0.1.1</w:t>
       </w:r>
     </w:p>
     <w:p>
@@ -76,7 +76,7 @@
           <w:color w:val="667085"/>
           <w:sz w:val="19"/>
         </w:rPr>
-        <w:t>文档版本：0.1.0  |  2026-07-15</w:t>
+        <w:t>文档版本：0.1.1  |  2026-07-18</w:t>
       </w:r>
     </w:p>
     <w:p>
@@ -169,6 +169,9 @@
         </w:tc>
       </w:tr>
       <w:tr>
+        <w:trPr>
+          <w:cantSplit w:val="true"/>
+        </w:trPr>
         <w:tc>
           <w:tcPr>
             <w:tcW w:type="dxa" w:w="2500"/>
@@ -223,6 +226,9 @@
         </w:tc>
       </w:tr>
       <w:tr>
+        <w:trPr>
+          <w:cantSplit w:val="true"/>
+        </w:trPr>
         <w:tc>
           <w:tcPr>
             <w:tcW w:type="dxa" w:w="2500"/>
@@ -277,6 +283,9 @@
         </w:tc>
       </w:tr>
       <w:tr>
+        <w:trPr>
+          <w:cantSplit w:val="true"/>
+        </w:trPr>
         <w:tc>
           <w:tcPr>
             <w:tcW w:type="dxa" w:w="2500"/>
@@ -331,6 +340,9 @@
         </w:tc>
       </w:tr>
       <w:tr>
+        <w:trPr>
+          <w:cantSplit w:val="true"/>
+        </w:trPr>
         <w:tc>
           <w:tcPr>
             <w:tcW w:type="dxa" w:w="2500"/>
@@ -385,6 +397,9 @@
         </w:tc>
       </w:tr>
       <w:tr>
+        <w:trPr>
+          <w:cantSplit w:val="true"/>
+        </w:trPr>
         <w:tc>
           <w:tcPr>
             <w:tcW w:type="dxa" w:w="2500"/>
@@ -439,6 +454,9 @@
         </w:tc>
       </w:tr>
       <w:tr>
+        <w:trPr>
+          <w:cantSplit w:val="true"/>
+        </w:trPr>
         <w:tc>
           <w:tcPr>
             <w:tcW w:type="dxa" w:w="2500"/>
@@ -768,6 +786,9 @@
         </w:tc>
       </w:tr>
       <w:tr>
+        <w:trPr>
+          <w:cantSplit w:val="true"/>
+        </w:trPr>
         <w:tc>
           <w:tcPr>
             <w:tcW w:type="dxa" w:w="1900"/>
@@ -822,6 +843,9 @@
         </w:tc>
       </w:tr>
       <w:tr>
+        <w:trPr>
+          <w:cantSplit w:val="true"/>
+        </w:trPr>
         <w:tc>
           <w:tcPr>
             <w:tcW w:type="dxa" w:w="1900"/>
@@ -876,6 +900,9 @@
         </w:tc>
       </w:tr>
       <w:tr>
+        <w:trPr>
+          <w:cantSplit w:val="true"/>
+        </w:trPr>
         <w:tc>
           <w:tcPr>
             <w:tcW w:type="dxa" w:w="1900"/>
@@ -930,6 +957,9 @@
         </w:tc>
       </w:tr>
       <w:tr>
+        <w:trPr>
+          <w:cantSplit w:val="true"/>
+        </w:trPr>
         <w:tc>
           <w:tcPr>
             <w:tcW w:type="dxa" w:w="1900"/>
@@ -984,6 +1014,9 @@
         </w:tc>
       </w:tr>
       <w:tr>
+        <w:trPr>
+          <w:cantSplit w:val="true"/>
+        </w:trPr>
         <w:tc>
           <w:tcPr>
             <w:tcW w:type="dxa" w:w="1900"/>
@@ -1038,6 +1071,9 @@
         </w:tc>
       </w:tr>
       <w:tr>
+        <w:trPr>
+          <w:cantSplit w:val="true"/>
+        </w:trPr>
         <w:tc>
           <w:tcPr>
             <w:tcW w:type="dxa" w:w="1900"/>
@@ -1107,7 +1143,7 @@
     </w:p>
     <w:p>
       <w:r>
-        <w:t>0.1.0 驱动使用本地测试证书，不是微软正式发布签名。安装向导会展示完整协议，只有勾选接受后才能继续。安装包不包含证书私钥。</w:t>
+        <w:t>0.1.1 驱动使用本地测试证书，不是微软正式发布签名。安装向导会展示完整协议，只有勾选接受后才能继续。安装包不包含证书私钥。</w:t>
       </w:r>
     </w:p>
     <w:p>
@@ -1400,6 +1436,9 @@
         </w:tc>
       </w:tr>
       <w:tr>
+        <w:trPr>
+          <w:cantSplit w:val="true"/>
+        </w:trPr>
         <w:tc>
           <w:tcPr>
             <w:tcW w:type="dxa" w:w="2100"/>
@@ -1454,6 +1493,9 @@
         </w:tc>
       </w:tr>
       <w:tr>
+        <w:trPr>
+          <w:cantSplit w:val="true"/>
+        </w:trPr>
         <w:tc>
           <w:tcPr>
             <w:tcW w:type="dxa" w:w="2100"/>
@@ -1508,6 +1550,9 @@
         </w:tc>
       </w:tr>
       <w:tr>
+        <w:trPr>
+          <w:cantSplit w:val="true"/>
+        </w:trPr>
         <w:tc>
           <w:tcPr>
             <w:tcW w:type="dxa" w:w="2100"/>
@@ -1562,6 +1607,9 @@
         </w:tc>
       </w:tr>
       <w:tr>
+        <w:trPr>
+          <w:cantSplit w:val="true"/>
+        </w:trPr>
         <w:tc>
           <w:tcPr>
             <w:tcW w:type="dxa" w:w="2100"/>
@@ -1616,6 +1664,9 @@
         </w:tc>
       </w:tr>
       <w:tr>
+        <w:trPr>
+          <w:cantSplit w:val="true"/>
+        </w:trPr>
         <w:tc>
           <w:tcPr>
             <w:tcW w:type="dxa" w:w="2100"/>
@@ -1863,6 +1914,9 @@
         </w:tc>
       </w:tr>
       <w:tr>
+        <w:trPr>
+          <w:cantSplit w:val="true"/>
+        </w:trPr>
         <w:tc>
           <w:tcPr>
             <w:tcW w:type="dxa" w:w="2100"/>
@@ -1917,6 +1971,9 @@
         </w:tc>
       </w:tr>
       <w:tr>
+        <w:trPr>
+          <w:cantSplit w:val="true"/>
+        </w:trPr>
         <w:tc>
           <w:tcPr>
             <w:tcW w:type="dxa" w:w="2100"/>
@@ -1971,6 +2028,9 @@
         </w:tc>
       </w:tr>
       <w:tr>
+        <w:trPr>
+          <w:cantSplit w:val="true"/>
+        </w:trPr>
         <w:tc>
           <w:tcPr>
             <w:tcW w:type="dxa" w:w="2100"/>
@@ -2025,6 +2085,9 @@
         </w:tc>
       </w:tr>
       <w:tr>
+        <w:trPr>
+          <w:cantSplit w:val="true"/>
+        </w:trPr>
         <w:tc>
           <w:tcPr>
             <w:tcW w:type="dxa" w:w="2100"/>
@@ -2079,6 +2142,9 @@
         </w:tc>
       </w:tr>
       <w:tr>
+        <w:trPr>
+          <w:cantSplit w:val="true"/>
+        </w:trPr>
         <w:tc>
           <w:tcPr>
             <w:tcW w:type="dxa" w:w="2100"/>
@@ -2133,6 +2199,9 @@
         </w:tc>
       </w:tr>
       <w:tr>
+        <w:trPr>
+          <w:cantSplit w:val="true"/>
+        </w:trPr>
         <w:tc>
           <w:tcPr>
             <w:tcW w:type="dxa" w:w="2100"/>
@@ -2187,6 +2256,9 @@
         </w:tc>
       </w:tr>
       <w:tr>
+        <w:trPr>
+          <w:cantSplit w:val="true"/>
+        </w:trPr>
         <w:tc>
           <w:tcPr>
             <w:tcW w:type="dxa" w:w="2100"/>
@@ -2241,6 +2313,9 @@
         </w:tc>
       </w:tr>
       <w:tr>
+        <w:trPr>
+          <w:cantSplit w:val="true"/>
+        </w:trPr>
         <w:tc>
           <w:tcPr>
             <w:tcW w:type="dxa" w:w="2100"/>
@@ -2295,6 +2370,9 @@
         </w:tc>
       </w:tr>
       <w:tr>
+        <w:trPr>
+          <w:cantSplit w:val="true"/>
+        </w:trPr>
         <w:tc>
           <w:tcPr>
             <w:tcW w:type="dxa" w:w="2100"/>
@@ -2548,6 +2626,9 @@
         </w:tc>
       </w:tr>
       <w:tr>
+        <w:trPr>
+          <w:cantSplit w:val="true"/>
+        </w:trPr>
         <w:tc>
           <w:tcPr>
             <w:tcW w:type="dxa" w:w="1900"/>
@@ -2602,6 +2683,9 @@
         </w:tc>
       </w:tr>
       <w:tr>
+        <w:trPr>
+          <w:cantSplit w:val="true"/>
+        </w:trPr>
         <w:tc>
           <w:tcPr>
             <w:tcW w:type="dxa" w:w="1900"/>
@@ -2656,6 +2740,9 @@
         </w:tc>
       </w:tr>
       <w:tr>
+        <w:trPr>
+          <w:cantSplit w:val="true"/>
+        </w:trPr>
         <w:tc>
           <w:tcPr>
             <w:tcW w:type="dxa" w:w="1900"/>
@@ -2710,6 +2797,9 @@
         </w:tc>
       </w:tr>
       <w:tr>
+        <w:trPr>
+          <w:cantSplit w:val="true"/>
+        </w:trPr>
         <w:tc>
           <w:tcPr>
             <w:tcW w:type="dxa" w:w="1900"/>
@@ -2764,6 +2854,9 @@
         </w:tc>
       </w:tr>
       <w:tr>
+        <w:trPr>
+          <w:cantSplit w:val="true"/>
+        </w:trPr>
         <w:tc>
           <w:tcPr>
             <w:tcW w:type="dxa" w:w="1900"/>
@@ -2818,6 +2911,9 @@
         </w:tc>
       </w:tr>
       <w:tr>
+        <w:trPr>
+          <w:cantSplit w:val="true"/>
+        </w:trPr>
         <w:tc>
           <w:tcPr>
             <w:tcW w:type="dxa" w:w="1900"/>
@@ -2872,6 +2968,9 @@
         </w:tc>
       </w:tr>
       <w:tr>
+        <w:trPr>
+          <w:cantSplit w:val="true"/>
+        </w:trPr>
         <w:tc>
           <w:tcPr>
             <w:tcW w:type="dxa" w:w="1900"/>
@@ -2926,6 +3025,9 @@
         </w:tc>
       </w:tr>
       <w:tr>
+        <w:trPr>
+          <w:cantSplit w:val="true"/>
+        </w:trPr>
         <w:tc>
           <w:tcPr>
             <w:tcW w:type="dxa" w:w="1900"/>
@@ -3247,6 +3349,9 @@
         </w:tc>
       </w:tr>
       <w:tr>
+        <w:trPr>
+          <w:cantSplit w:val="true"/>
+        </w:trPr>
         <w:tc>
           <w:tcPr>
             <w:tcW w:type="dxa" w:w="2100"/>
@@ -3301,6 +3406,9 @@
         </w:tc>
       </w:tr>
       <w:tr>
+        <w:trPr>
+          <w:cantSplit w:val="true"/>
+        </w:trPr>
         <w:tc>
           <w:tcPr>
             <w:tcW w:type="dxa" w:w="2100"/>
@@ -3355,6 +3463,9 @@
         </w:tc>
       </w:tr>
       <w:tr>
+        <w:trPr>
+          <w:cantSplit w:val="true"/>
+        </w:trPr>
         <w:tc>
           <w:tcPr>
             <w:tcW w:type="dxa" w:w="2100"/>
@@ -3409,6 +3520,9 @@
         </w:tc>
       </w:tr>
       <w:tr>
+        <w:trPr>
+          <w:cantSplit w:val="true"/>
+        </w:trPr>
         <w:tc>
           <w:tcPr>
             <w:tcW w:type="dxa" w:w="2100"/>
@@ -3463,6 +3577,9 @@
         </w:tc>
       </w:tr>
       <w:tr>
+        <w:trPr>
+          <w:cantSplit w:val="true"/>
+        </w:trPr>
         <w:tc>
           <w:tcPr>
             <w:tcW w:type="dxa" w:w="2100"/>
@@ -3517,6 +3634,9 @@
         </w:tc>
       </w:tr>
       <w:tr>
+        <w:trPr>
+          <w:cantSplit w:val="true"/>
+        </w:trPr>
         <w:tc>
           <w:tcPr>
             <w:tcW w:type="dxa" w:w="2100"/>
@@ -3571,6 +3691,9 @@
         </w:tc>
       </w:tr>
       <w:tr>
+        <w:trPr>
+          <w:cantSplit w:val="true"/>
+        </w:trPr>
         <w:tc>
           <w:tcPr>
             <w:tcW w:type="dxa" w:w="2100"/>
@@ -3625,6 +3748,9 @@
         </w:tc>
       </w:tr>
       <w:tr>
+        <w:trPr>
+          <w:cantSplit w:val="true"/>
+        </w:trPr>
         <w:tc>
           <w:tcPr>
             <w:tcW w:type="dxa" w:w="2100"/>
@@ -3930,6 +4056,9 @@
         </w:tc>
       </w:tr>
       <w:tr>
+        <w:trPr>
+          <w:cantSplit w:val="true"/>
+        </w:trPr>
         <w:tc>
           <w:tcPr>
             <w:tcW w:type="dxa" w:w="1800"/>
@@ -3984,6 +4113,9 @@
         </w:tc>
       </w:tr>
       <w:tr>
+        <w:trPr>
+          <w:cantSplit w:val="true"/>
+        </w:trPr>
         <w:tc>
           <w:tcPr>
             <w:tcW w:type="dxa" w:w="1800"/>
@@ -4038,6 +4170,9 @@
         </w:tc>
       </w:tr>
       <w:tr>
+        <w:trPr>
+          <w:cantSplit w:val="true"/>
+        </w:trPr>
         <w:tc>
           <w:tcPr>
             <w:tcW w:type="dxa" w:w="1800"/>
@@ -4209,6 +4344,9 @@
         </w:tc>
       </w:tr>
       <w:tr>
+        <w:trPr>
+          <w:cantSplit w:val="true"/>
+        </w:trPr>
         <w:tc>
           <w:tcPr>
             <w:tcW w:type="dxa" w:w="1900"/>
@@ -4263,6 +4401,9 @@
         </w:tc>
       </w:tr>
       <w:tr>
+        <w:trPr>
+          <w:cantSplit w:val="true"/>
+        </w:trPr>
         <w:tc>
           <w:tcPr>
             <w:tcW w:type="dxa" w:w="1900"/>
@@ -4317,6 +4458,9 @@
         </w:tc>
       </w:tr>
       <w:tr>
+        <w:trPr>
+          <w:cantSplit w:val="true"/>
+        </w:trPr>
         <w:tc>
           <w:tcPr>
             <w:tcW w:type="dxa" w:w="1900"/>
@@ -4371,6 +4515,9 @@
         </w:tc>
       </w:tr>
       <w:tr>
+        <w:trPr>
+          <w:cantSplit w:val="true"/>
+        </w:trPr>
         <w:tc>
           <w:tcPr>
             <w:tcW w:type="dxa" w:w="1900"/>
@@ -4425,6 +4572,9 @@
         </w:tc>
       </w:tr>
       <w:tr>
+        <w:trPr>
+          <w:cantSplit w:val="true"/>
+        </w:trPr>
         <w:tc>
           <w:tcPr>
             <w:tcW w:type="dxa" w:w="1900"/>
@@ -4950,6 +5100,9 @@
         </w:tc>
       </w:tr>
       <w:tr>
+        <w:trPr>
+          <w:cantSplit w:val="true"/>
+        </w:trPr>
         <w:tc>
           <w:tcPr>
             <w:tcW w:type="dxa" w:w="1700"/>
@@ -5004,6 +5157,9 @@
         </w:tc>
       </w:tr>
       <w:tr>
+        <w:trPr>
+          <w:cantSplit w:val="true"/>
+        </w:trPr>
         <w:tc>
           <w:tcPr>
             <w:tcW w:type="dxa" w:w="1700"/>
@@ -5058,6 +5214,9 @@
         </w:tc>
       </w:tr>
       <w:tr>
+        <w:trPr>
+          <w:cantSplit w:val="true"/>
+        </w:trPr>
         <w:tc>
           <w:tcPr>
             <w:tcW w:type="dxa" w:w="1700"/>
@@ -5112,6 +5271,9 @@
         </w:tc>
       </w:tr>
       <w:tr>
+        <w:trPr>
+          <w:cantSplit w:val="true"/>
+        </w:trPr>
         <w:tc>
           <w:tcPr>
             <w:tcW w:type="dxa" w:w="1700"/>
@@ -5166,6 +5328,9 @@
         </w:tc>
       </w:tr>
       <w:tr>
+        <w:trPr>
+          <w:cantSplit w:val="true"/>
+        </w:trPr>
         <w:tc>
           <w:tcPr>
             <w:tcW w:type="dxa" w:w="1700"/>
@@ -5220,6 +5385,9 @@
         </w:tc>
       </w:tr>
       <w:tr>
+        <w:trPr>
+          <w:cantSplit w:val="true"/>
+        </w:trPr>
         <w:tc>
           <w:tcPr>
             <w:tcW w:type="dxa" w:w="1700"/>
@@ -5274,6 +5442,9 @@
         </w:tc>
       </w:tr>
       <w:tr>
+        <w:trPr>
+          <w:cantSplit w:val="true"/>
+        </w:trPr>
         <w:tc>
           <w:tcPr>
             <w:tcW w:type="dxa" w:w="1700"/>
@@ -5328,6 +5499,9 @@
         </w:tc>
       </w:tr>
       <w:tr>
+        <w:trPr>
+          <w:cantSplit w:val="true"/>
+        </w:trPr>
         <w:tc>
           <w:tcPr>
             <w:tcW w:type="dxa" w:w="1700"/>
@@ -5472,6 +5646,9 @@
         </w:tc>
       </w:tr>
       <w:tr>
+        <w:trPr>
+          <w:cantSplit w:val="true"/>
+        </w:trPr>
         <w:tc>
           <w:tcPr>
             <w:tcW w:type="dxa" w:w="2600"/>
@@ -5526,6 +5703,9 @@
         </w:tc>
       </w:tr>
       <w:tr>
+        <w:trPr>
+          <w:cantSplit w:val="true"/>
+        </w:trPr>
         <w:tc>
           <w:tcPr>
             <w:tcW w:type="dxa" w:w="2600"/>
@@ -5580,6 +5760,9 @@
         </w:tc>
       </w:tr>
       <w:tr>
+        <w:trPr>
+          <w:cantSplit w:val="true"/>
+        </w:trPr>
         <w:tc>
           <w:tcPr>
             <w:tcW w:type="dxa" w:w="2600"/>
@@ -5634,6 +5817,9 @@
         </w:tc>
       </w:tr>
       <w:tr>
+        <w:trPr>
+          <w:cantSplit w:val="true"/>
+        </w:trPr>
         <w:tc>
           <w:tcPr>
             <w:tcW w:type="dxa" w:w="2600"/>
@@ -5688,6 +5874,9 @@
         </w:tc>
       </w:tr>
       <w:tr>
+        <w:trPr>
+          <w:cantSplit w:val="true"/>
+        </w:trPr>
         <w:tc>
           <w:tcPr>
             <w:tcW w:type="dxa" w:w="2600"/>
@@ -5742,6 +5931,9 @@
         </w:tc>
       </w:tr>
       <w:tr>
+        <w:trPr>
+          <w:cantSplit w:val="true"/>
+        </w:trPr>
         <w:tc>
           <w:tcPr>
             <w:tcW w:type="dxa" w:w="2600"/>
@@ -5913,6 +6105,9 @@
         </w:tc>
       </w:tr>
       <w:tr>
+        <w:trPr>
+          <w:cantSplit w:val="true"/>
+        </w:trPr>
         <w:tc>
           <w:tcPr>
             <w:tcW w:type="dxa" w:w="3300"/>
@@ -5967,6 +6162,9 @@
         </w:tc>
       </w:tr>
       <w:tr>
+        <w:trPr>
+          <w:cantSplit w:val="true"/>
+        </w:trPr>
         <w:tc>
           <w:tcPr>
             <w:tcW w:type="dxa" w:w="3300"/>
@@ -6055,7 +6253,7 @@
           <w:color w:val="243447"/>
           <w:sz w:val="21"/>
         </w:rPr>
-        <w:t>Windows Server 2022/2025 只完成 GitHub 托管桌面 runner 的平台、托管测试和安装契约检查，未装载内核驱动；Server Core 只有布局契约测试，Server 2019 自托管任务未执行。0.1.0 没有任何 Server 驱动端到端实测，重要环境必须先在同版本测试机完成全流程验证。</w:t>
+        <w:t>0.1.0 是现有 Windows Server 自动化与契约验证的历史基线：Windows Server 2022/2025 只完成 GitHub 托管桌面 runner 的平台、托管测试和安装契约检查，未装载内核驱动；Server Core 只有布局契约测试，Server 2019 自托管任务未执行。0.1.1 没有新增任何 Windows Server 内核驱动端到端验收，重要环境必须先在同版本测试机完成全流程验证。</w:t>
       </w:r>
     </w:p>
     <w:p>
@@ -6172,7 +6370,7 @@
     </w:p>
     <w:p>
       <w:r>
-        <w:t>0.1.0 不支持在已有新式安装上原地覆盖。不要直接覆盖正在加载的 SYS、后台服务 EXE 或受保护安装记录。</w:t>
+        <w:t>0.1.1 不支持在已有新式安装上原地覆盖。不要直接覆盖正在加载的 SYS、后台服务 EXE 或受保护安装记录。</w:t>
       </w:r>
     </w:p>
     <w:p>
@@ -6290,6 +6488,9 @@
         </w:tc>
       </w:tr>
       <w:tr>
+        <w:trPr>
+          <w:cantSplit w:val="true"/>
+        </w:trPr>
         <w:tc>
           <w:tcPr>
             <w:tcW w:type="dxa" w:w="1800"/>
@@ -6370,6 +6571,9 @@
         </w:tc>
       </w:tr>
       <w:tr>
+        <w:trPr>
+          <w:cantSplit w:val="true"/>
+        </w:trPr>
         <w:tc>
           <w:tcPr>
             <w:tcW w:type="dxa" w:w="1800"/>
@@ -6450,6 +6654,9 @@
         </w:tc>
       </w:tr>
       <w:tr>
+        <w:trPr>
+          <w:cantSplit w:val="true"/>
+        </w:trPr>
         <w:tc>
           <w:tcPr>
             <w:tcW w:type="dxa" w:w="1800"/>
@@ -6530,6 +6737,9 @@
         </w:tc>
       </w:tr>
       <w:tr>
+        <w:trPr>
+          <w:cantSplit w:val="true"/>
+        </w:trPr>
         <w:tc>
           <w:tcPr>
             <w:tcW w:type="dxa" w:w="1800"/>
@@ -6610,6 +6820,9 @@
         </w:tc>
       </w:tr>
       <w:tr>
+        <w:trPr>
+          <w:cantSplit w:val="true"/>
+        </w:trPr>
         <w:tc>
           <w:tcPr>
             <w:tcW w:type="dxa" w:w="1800"/>
@@ -6690,6 +6903,9 @@
         </w:tc>
       </w:tr>
       <w:tr>
+        <w:trPr>
+          <w:cantSplit w:val="true"/>
+        </w:trPr>
         <w:tc>
           <w:tcPr>
             <w:tcW w:type="dxa" w:w="1800"/>
@@ -6770,6 +6986,9 @@
         </w:tc>
       </w:tr>
       <w:tr>
+        <w:trPr>
+          <w:cantSplit w:val="true"/>
+        </w:trPr>
         <w:tc>
           <w:tcPr>
             <w:tcW w:type="dxa" w:w="1800"/>
@@ -6850,6 +7069,9 @@
         </w:tc>
       </w:tr>
       <w:tr>
+        <w:trPr>
+          <w:cantSplit w:val="true"/>
+        </w:trPr>
         <w:tc>
           <w:tcPr>
             <w:tcW w:type="dxa" w:w="1800"/>
@@ -7282,6 +7504,9 @@
         </w:tc>
       </w:tr>
       <w:tr>
+        <w:trPr>
+          <w:cantSplit w:val="true"/>
+        </w:trPr>
         <w:tc>
           <w:tcPr>
             <w:tcW w:type="dxa" w:w="2100"/>
@@ -7336,6 +7561,9 @@
         </w:tc>
       </w:tr>
       <w:tr>
+        <w:trPr>
+          <w:cantSplit w:val="true"/>
+        </w:trPr>
         <w:tc>
           <w:tcPr>
             <w:tcW w:type="dxa" w:w="2100"/>
@@ -7390,6 +7618,9 @@
         </w:tc>
       </w:tr>
       <w:tr>
+        <w:trPr>
+          <w:cantSplit w:val="true"/>
+        </w:trPr>
         <w:tc>
           <w:tcPr>
             <w:tcW w:type="dxa" w:w="2100"/>
@@ -7444,6 +7675,9 @@
         </w:tc>
       </w:tr>
       <w:tr>
+        <w:trPr>
+          <w:cantSplit w:val="true"/>
+        </w:trPr>
         <w:tc>
           <w:tcPr>
             <w:tcW w:type="dxa" w:w="2100"/>
@@ -7498,6 +7732,9 @@
         </w:tc>
       </w:tr>
       <w:tr>
+        <w:trPr>
+          <w:cantSplit w:val="true"/>
+        </w:trPr>
         <w:tc>
           <w:tcPr>
             <w:tcW w:type="dxa" w:w="2100"/>
@@ -7552,6 +7789,9 @@
         </w:tc>
       </w:tr>
       <w:tr>
+        <w:trPr>
+          <w:cantSplit w:val="true"/>
+        </w:trPr>
         <w:tc>
           <w:tcPr>
             <w:tcW w:type="dxa" w:w="2100"/>

</xml_diff>

<commit_message>
docs: publish self-contained licensed manual
</commit_message>
<xml_diff>
--- a/manual/Lemon串口监控-完整操作手册.docx
+++ b/manual/Lemon串口监控-完整操作手册.docx
@@ -515,6 +515,33 @@
       <w:pPr>
         <w:spacing w:after="40"/>
       </w:pPr>
+    </w:p>
+    <w:p>
+      <w:pPr>
+        <w:spacing w:before="80" w:after="160" w:line="288" w:lineRule="auto"/>
+        <w:shd w:fill="F4F6F9"/>
+        <w:pBdr>
+          <w:left w:val="single" w:sz="18" w:space="7" w:color="2E74B5"/>
+        </w:pBdr>
+        <w:ind w:left="160" w:right="100"/>
+      </w:pPr>
+      <w:r>
+        <w:rPr>
+          <w:rFonts w:ascii="Calibri" w:hAnsi="Calibri" w:eastAsia="Microsoft YaHei UI"/>
+          <w:b/>
+          <w:color w:val="2E74B5"/>
+          <w:sz w:val="21"/>
+        </w:rPr>
+        <w:t>开源与署名：</w:t>
+      </w:r>
+      <w:r>
+        <w:rPr>
+          <w:rFonts w:ascii="Calibri" w:hAnsi="Calibri" w:eastAsia="Microsoft YaHei UI"/>
+          <w:color w:val="243447"/>
+          <w:sz w:val="21"/>
+        </w:rPr>
+        <w:t>本软件按 MIT 许可证开源，允许免费使用、修改和分发；允许商业使用和盈利。复制或分发本软件或其实质部分时，必须保留 Copyright (c) 2026 qingningmneg 版权声明和 MIT 许可声明。完整条款见手册末尾附录或安装目录 docs\LICENSE.txt。</w:t>
+      </w:r>
     </w:p>
     <w:p>
       <w:pPr>
@@ -7852,11 +7879,6 @@
       </w:pPr>
     </w:p>
     <w:p>
-      <w:r>
-        <w:br w:type="page"/>
-      </w:r>
-    </w:p>
-    <w:p>
       <w:pPr>
         <w:pStyle w:val="Heading1"/>
       </w:pPr>
@@ -7961,6 +7983,221 @@
           <w:sz w:val="21"/>
         </w:rPr>
         <w:t>任何监控界面都不能替代原发送端和接收端日志。做故障定责、协议验证或无损验收时，应同时保留双方原始日志、会话/导出、状态输出和文件哈希。</w:t>
+      </w:r>
+    </w:p>
+    <w:p>
+      <w:r>
+        <w:br w:type="page"/>
+      </w:r>
+    </w:p>
+    <w:p>
+      <w:pPr>
+        <w:pStyle w:val="Heading1"/>
+      </w:pPr>
+      <w:r>
+        <w:t>附录：MIT License</w:t>
+      </w:r>
+    </w:p>
+    <w:p>
+      <w:r>
+        <w:t>以下为仓库根目录 LICENSE 的完整规范文本；安装目录中的副本位于 docs\LICENSE.txt。</w:t>
+      </w:r>
+    </w:p>
+    <w:p>
+      <w:pPr>
+        <w:spacing w:after="160" w:line="259" w:lineRule="auto"/>
+      </w:pPr>
+      <w:r>
+        <w:rPr>
+          <w:rFonts w:ascii="Calibri" w:hAnsi="Calibri" w:eastAsia="Microsoft YaHei UI"/>
+          <w:color w:val="243447"/>
+          <w:sz w:val="19"/>
+        </w:rPr>
+        <w:t>MIT License</w:t>
+      </w:r>
+    </w:p>
+    <w:p>
+      <w:pPr>
+        <w:spacing w:after="160" w:line="259" w:lineRule="auto"/>
+      </w:pPr>
+      <w:r>
+        <w:rPr>
+          <w:rFonts w:ascii="Calibri" w:hAnsi="Calibri" w:eastAsia="Microsoft YaHei UI"/>
+          <w:color w:val="243447"/>
+          <w:sz w:val="19"/>
+        </w:rPr>
+        <w:t>Copyright (c) 2026 qingningmneg</w:t>
+      </w:r>
+    </w:p>
+    <w:p>
+      <w:pPr>
+        <w:spacing w:after="160" w:line="259" w:lineRule="auto"/>
+      </w:pPr>
+      <w:r>
+        <w:rPr>
+          <w:rFonts w:ascii="Calibri" w:hAnsi="Calibri" w:eastAsia="Microsoft YaHei UI"/>
+          <w:color w:val="243447"/>
+          <w:sz w:val="19"/>
+        </w:rPr>
+        <w:t>Permission is hereby granted, free of charge, to any person obtaining a copy</w:t>
+      </w:r>
+      <w:r>
+        <w:br/>
+      </w:r>
+      <w:r>
+        <w:rPr>
+          <w:rFonts w:ascii="Calibri" w:hAnsi="Calibri" w:eastAsia="Microsoft YaHei UI"/>
+          <w:color w:val="243447"/>
+          <w:sz w:val="19"/>
+        </w:rPr>
+        <w:t>of this software and associated documentation files (the "Software"), to deal</w:t>
+      </w:r>
+      <w:r>
+        <w:br/>
+      </w:r>
+      <w:r>
+        <w:rPr>
+          <w:rFonts w:ascii="Calibri" w:hAnsi="Calibri" w:eastAsia="Microsoft YaHei UI"/>
+          <w:color w:val="243447"/>
+          <w:sz w:val="19"/>
+        </w:rPr>
+        <w:t>in the Software without restriction, including without limitation the rights</w:t>
+      </w:r>
+      <w:r>
+        <w:br/>
+      </w:r>
+      <w:r>
+        <w:rPr>
+          <w:rFonts w:ascii="Calibri" w:hAnsi="Calibri" w:eastAsia="Microsoft YaHei UI"/>
+          <w:color w:val="243447"/>
+          <w:sz w:val="19"/>
+        </w:rPr>
+        <w:t>to use, copy, modify, merge, publish, distribute, sublicense, and/or sell</w:t>
+      </w:r>
+      <w:r>
+        <w:br/>
+      </w:r>
+      <w:r>
+        <w:rPr>
+          <w:rFonts w:ascii="Calibri" w:hAnsi="Calibri" w:eastAsia="Microsoft YaHei UI"/>
+          <w:color w:val="243447"/>
+          <w:sz w:val="19"/>
+        </w:rPr>
+        <w:t>copies of the Software, and to permit persons to whom the Software is</w:t>
+      </w:r>
+      <w:r>
+        <w:br/>
+      </w:r>
+      <w:r>
+        <w:rPr>
+          <w:rFonts w:ascii="Calibri" w:hAnsi="Calibri" w:eastAsia="Microsoft YaHei UI"/>
+          <w:color w:val="243447"/>
+          <w:sz w:val="19"/>
+        </w:rPr>
+        <w:t>furnished to do so, subject to the following conditions:</w:t>
+      </w:r>
+    </w:p>
+    <w:p>
+      <w:pPr>
+        <w:spacing w:after="160" w:line="259" w:lineRule="auto"/>
+      </w:pPr>
+      <w:r>
+        <w:rPr>
+          <w:rFonts w:ascii="Calibri" w:hAnsi="Calibri" w:eastAsia="Microsoft YaHei UI"/>
+          <w:color w:val="243447"/>
+          <w:sz w:val="19"/>
+        </w:rPr>
+        <w:t>The above copyright notice and this permission notice shall be included in all</w:t>
+      </w:r>
+      <w:r>
+        <w:br/>
+      </w:r>
+      <w:r>
+        <w:rPr>
+          <w:rFonts w:ascii="Calibri" w:hAnsi="Calibri" w:eastAsia="Microsoft YaHei UI"/>
+          <w:color w:val="243447"/>
+          <w:sz w:val="19"/>
+        </w:rPr>
+        <w:t>copies or substantial portions of the Software.</w:t>
+      </w:r>
+    </w:p>
+    <w:p>
+      <w:pPr>
+        <w:spacing w:after="160" w:line="259" w:lineRule="auto"/>
+      </w:pPr>
+      <w:r>
+        <w:rPr>
+          <w:rFonts w:ascii="Calibri" w:hAnsi="Calibri" w:eastAsia="Microsoft YaHei UI"/>
+          <w:color w:val="243447"/>
+          <w:sz w:val="19"/>
+        </w:rPr>
+        <w:t>THE SOFTWARE IS PROVIDED "AS IS", WITHOUT WARRANTY OF ANY KIND, EXPRESS OR</w:t>
+      </w:r>
+      <w:r>
+        <w:br/>
+      </w:r>
+      <w:r>
+        <w:rPr>
+          <w:rFonts w:ascii="Calibri" w:hAnsi="Calibri" w:eastAsia="Microsoft YaHei UI"/>
+          <w:color w:val="243447"/>
+          <w:sz w:val="19"/>
+        </w:rPr>
+        <w:t>IMPLIED, INCLUDING BUT NOT LIMITED TO THE WARRANTIES OF MERCHANTABILITY,</w:t>
+      </w:r>
+      <w:r>
+        <w:br/>
+      </w:r>
+      <w:r>
+        <w:rPr>
+          <w:rFonts w:ascii="Calibri" w:hAnsi="Calibri" w:eastAsia="Microsoft YaHei UI"/>
+          <w:color w:val="243447"/>
+          <w:sz w:val="19"/>
+        </w:rPr>
+        <w:t>FITNESS FOR A PARTICULAR PURPOSE AND NONINFRINGEMENT. IN NO EVENT SHALL THE</w:t>
+      </w:r>
+      <w:r>
+        <w:br/>
+      </w:r>
+      <w:r>
+        <w:rPr>
+          <w:rFonts w:ascii="Calibri" w:hAnsi="Calibri" w:eastAsia="Microsoft YaHei UI"/>
+          <w:color w:val="243447"/>
+          <w:sz w:val="19"/>
+        </w:rPr>
+        <w:t>AUTHORS OR COPYRIGHT HOLDERS BE LIABLE FOR ANY CLAIM, DAMAGES OR OTHER</w:t>
+      </w:r>
+      <w:r>
+        <w:br/>
+      </w:r>
+      <w:r>
+        <w:rPr>
+          <w:rFonts w:ascii="Calibri" w:hAnsi="Calibri" w:eastAsia="Microsoft YaHei UI"/>
+          <w:color w:val="243447"/>
+          <w:sz w:val="19"/>
+        </w:rPr>
+        <w:t>LIABILITY, WHETHER IN AN ACTION OF CONTRACT, TORT OR OTHERWISE, ARISING FROM,</w:t>
+      </w:r>
+      <w:r>
+        <w:br/>
+      </w:r>
+      <w:r>
+        <w:rPr>
+          <w:rFonts w:ascii="Calibri" w:hAnsi="Calibri" w:eastAsia="Microsoft YaHei UI"/>
+          <w:color w:val="243447"/>
+          <w:sz w:val="19"/>
+        </w:rPr>
+        <w:t>OUT OF OR IN CONNECTION WITH THE SOFTWARE OR THE USE OR OTHER DEALINGS IN THE</w:t>
+      </w:r>
+      <w:r>
+        <w:br/>
+      </w:r>
+      <w:r>
+        <w:rPr>
+          <w:rFonts w:ascii="Calibri" w:hAnsi="Calibri" w:eastAsia="Microsoft YaHei UI"/>
+          <w:color w:val="243447"/>
+          <w:sz w:val="19"/>
+        </w:rPr>
+        <w:t>SOFTWARE.</w:t>
       </w:r>
     </w:p>
     <w:sectPr>

</xml_diff>